<commit_message>
Fix DEF-02 and DEF-03 in v1.2 and re-run every suite
- app.py v1.2: logout ends the server session (DEF-02); connection queue 5 -> 128 (DEF-03)
- app_v1_1.py kept for before/after comparison; logs per build
- Re-run on v1.2: functional 32/32, system 7/7, browsers 2/2, acceptance cycle 3 15/15
- Updated READMEs, results analysis, charts, report template, acceptance docx

Co-Authored-By: Claude Opus 5.5 (1M context) <noreply@anthropic.com>
Claude-Session: https://claude.ai/code/session_01TKXkuF2vC1qb8qPeCui7y3
</commit_message>
<xml_diff>
--- a/3-acceptance-testing/docs/Acceptance_Testing_UniReg_Yasierul_SHORT.docx
+++ b/3-acceptance-testing/docs/Acceptance_Testing_UniReg_Yasierul_SHORT.docx
@@ -3778,7 +3778,7 @@
         <w:jc w:val="both"/>
       </w:pPr>
       <w:r>
-        <w:t xml:space="preserve">Two cycles were run on 12 October 2026. In Cycle 1 (build v1.0), 14 of 15 tests passed. In Cycle 2 (build v1.1, after the fix), all 15 of 15 passed.</w:t>
+        <w:t xml:space="preserve">Three cycles were run on 12 October 2026. In Cycle 1 (build v1.0), 14 of 15 tests passed. In Cycle 2 (build v1.1, after the DEF-01 fix), all 15 of 15 passed. Cycle 3 (build v1.2, after fixing DEF-02 and DEF-03 from the other stages) passed all 15 of 15 again; the slowest UAT-15 response fell to 0.56 s.</w:t>
       </w:r>
     </w:p>
     <w:tbl>
@@ -6566,7 +6566,7 @@
         <w:pStyle w:val="Heading3"/>
       </w:pPr>
       <w:r>
-        <w:t xml:space="preserve">Defect found</w:t>
+        <w:t xml:space="preserve">Defects</w:t>
       </w:r>
     </w:p>
     <w:tbl>
@@ -6582,8 +6582,11 @@
         </w:tblBorders>
       </w:tblPr>
       <w:tblGrid>
-        <w:gridCol w:w="1805"/>
-        <w:gridCol w:w="7221"/>
+        <w:gridCol w:w="812"/>
+        <w:gridCol w:w="993"/>
+        <w:gridCol w:w="3971"/>
+        <w:gridCol w:w="903"/>
+        <w:gridCol w:w="2347"/>
       </w:tblGrid>
       <w:tr>
         <w:trPr>
@@ -6591,7 +6594,7 @@
         </w:trPr>
         <w:tc>
           <w:tcPr>
-            <w:tcW w:type="dxa" w:w="1805"/>
+            <w:tcW w:type="dxa" w:w="812"/>
             <w:tcBorders>
               <w:top w:val="single" w:color="8C9BAB" w:sz="4"/>
               <w:left w:val="single" w:color="8C9BAB" w:sz="4"/>
@@ -6620,13 +6623,13 @@
                 <w:sz w:val="18"/>
                 <w:szCs w:val="18"/>
               </w:rPr>
-              <w:t xml:space="preserve">Field</w:t>
-            </w:r>
-          </w:p>
-        </w:tc>
-        <w:tc>
-          <w:tcPr>
-            <w:tcW w:type="dxa" w:w="7221"/>
+              <w:t xml:space="preserve">ID</w:t>
+            </w:r>
+          </w:p>
+        </w:tc>
+        <w:tc>
+          <w:tcPr>
+            <w:tcW w:type="dxa" w:w="993"/>
             <w:tcBorders>
               <w:top w:val="single" w:color="8C9BAB" w:sz="4"/>
               <w:left w:val="single" w:color="8C9BAB" w:sz="4"/>
@@ -6655,7 +6658,112 @@
                 <w:sz w:val="18"/>
                 <w:szCs w:val="18"/>
               </w:rPr>
-              <w:t xml:space="preserve">Details</w:t>
+              <w:t xml:space="preserve">Found by</w:t>
+            </w:r>
+          </w:p>
+        </w:tc>
+        <w:tc>
+          <w:tcPr>
+            <w:tcW w:type="dxa" w:w="3971"/>
+            <w:tcBorders>
+              <w:top w:val="single" w:color="8C9BAB" w:sz="4"/>
+              <w:left w:val="single" w:color="8C9BAB" w:sz="4"/>
+              <w:bottom w:val="single" w:color="8C9BAB" w:sz="4"/>
+              <w:right w:val="single" w:color="8C9BAB" w:sz="4"/>
+            </w:tcBorders>
+            <w:shd w:fill="1F3A5F" w:color="auto" w:val="clear"/>
+            <w:tcMar>
+              <w:top w:type="dxa" w:w="60"/>
+              <w:left w:type="dxa" w:w="90"/>
+              <w:bottom w:type="dxa" w:w="60"/>
+              <w:right w:type="dxa" w:w="90"/>
+            </w:tcMar>
+            <w:vAlign w:val="top"/>
+          </w:tcPr>
+          <w:p>
+            <w:pPr>
+              <w:spacing w:after="40"/>
+              <w:jc w:val="left"/>
+            </w:pPr>
+            <w:r>
+              <w:rPr>
+                <w:b/>
+                <w:bCs/>
+                <w:color w:val="FFFFFF"/>
+                <w:sz w:val="18"/>
+                <w:szCs w:val="18"/>
+              </w:rPr>
+              <w:t xml:space="preserve">Problem and cause</w:t>
+            </w:r>
+          </w:p>
+        </w:tc>
+        <w:tc>
+          <w:tcPr>
+            <w:tcW w:type="dxa" w:w="903"/>
+            <w:tcBorders>
+              <w:top w:val="single" w:color="8C9BAB" w:sz="4"/>
+              <w:left w:val="single" w:color="8C9BAB" w:sz="4"/>
+              <w:bottom w:val="single" w:color="8C9BAB" w:sz="4"/>
+              <w:right w:val="single" w:color="8C9BAB" w:sz="4"/>
+            </w:tcBorders>
+            <w:shd w:fill="1F3A5F" w:color="auto" w:val="clear"/>
+            <w:tcMar>
+              <w:top w:type="dxa" w:w="60"/>
+              <w:left w:type="dxa" w:w="90"/>
+              <w:bottom w:type="dxa" w:w="60"/>
+              <w:right w:type="dxa" w:w="90"/>
+            </w:tcMar>
+            <w:vAlign w:val="top"/>
+          </w:tcPr>
+          <w:p>
+            <w:pPr>
+              <w:spacing w:after="40"/>
+              <w:jc w:val="left"/>
+            </w:pPr>
+            <w:r>
+              <w:rPr>
+                <w:b/>
+                <w:bCs/>
+                <w:color w:val="FFFFFF"/>
+                <w:sz w:val="18"/>
+                <w:szCs w:val="18"/>
+              </w:rPr>
+              <w:t xml:space="preserve">Severity</w:t>
+            </w:r>
+          </w:p>
+        </w:tc>
+        <w:tc>
+          <w:tcPr>
+            <w:tcW w:type="dxa" w:w="2347"/>
+            <w:tcBorders>
+              <w:top w:val="single" w:color="8C9BAB" w:sz="4"/>
+              <w:left w:val="single" w:color="8C9BAB" w:sz="4"/>
+              <w:bottom w:val="single" w:color="8C9BAB" w:sz="4"/>
+              <w:right w:val="single" w:color="8C9BAB" w:sz="4"/>
+            </w:tcBorders>
+            <w:shd w:fill="1F3A5F" w:color="auto" w:val="clear"/>
+            <w:tcMar>
+              <w:top w:type="dxa" w:w="60"/>
+              <w:left w:type="dxa" w:w="90"/>
+              <w:bottom w:type="dxa" w:w="60"/>
+              <w:right w:type="dxa" w:w="90"/>
+            </w:tcMar>
+            <w:vAlign w:val="top"/>
+          </w:tcPr>
+          <w:p>
+            <w:pPr>
+              <w:spacing w:after="40"/>
+              <w:jc w:val="left"/>
+            </w:pPr>
+            <w:r>
+              <w:rPr>
+                <w:b/>
+                <w:bCs/>
+                <w:color w:val="FFFFFF"/>
+                <w:sz w:val="18"/>
+                <w:szCs w:val="18"/>
+              </w:rPr>
+              <w:t xml:space="preserve">Fix and retest</w:t>
             </w:r>
           </w:p>
         </w:tc>
@@ -6666,7 +6774,7 @@
         </w:trPr>
         <w:tc>
           <w:tcPr>
-            <w:tcW w:type="dxa" w:w="1805"/>
+            <w:tcW w:type="dxa" w:w="812"/>
             <w:tcBorders>
               <w:top w:val="single" w:color="8C9BAB" w:sz="4"/>
               <w:left w:val="single" w:color="8C9BAB" w:sz="4"/>
@@ -6699,34 +6807,133 @@
         </w:tc>
         <w:tc>
           <w:tcPr>
-            <w:tcW w:type="dxa" w:w="7221"/>
-            <w:tcBorders>
-              <w:top w:val="single" w:color="8C9BAB" w:sz="4"/>
-              <w:left w:val="single" w:color="8C9BAB" w:sz="4"/>
-              <w:bottom w:val="single" w:color="8C9BAB" w:sz="4"/>
-              <w:right w:val="single" w:color="8C9BAB" w:sz="4"/>
-            </w:tcBorders>
-            <w:tcMar>
-              <w:top w:type="dxa" w:w="60"/>
-              <w:left w:type="dxa" w:w="90"/>
-              <w:bottom w:type="dxa" w:w="60"/>
-              <w:right w:type="dxa" w:w="90"/>
-            </w:tcMar>
-            <w:vAlign w:val="top"/>
-          </w:tcPr>
-          <w:p>
-            <w:pPr>
-              <w:spacing w:after="40"/>
-              <w:jc w:val="left"/>
-            </w:pPr>
-            <w:r>
-              <w:rPr>
-                <w:b w:val="false"/>
-                <w:bCs w:val="false"/>
-                <w:sz w:val="18"/>
-                <w:szCs w:val="18"/>
-              </w:rPr>
-              <w:t xml:space="preserve">Course over-enrolled when many students register for the last seats at once</w:t>
+            <w:tcW w:type="dxa" w:w="993"/>
+            <w:tcBorders>
+              <w:top w:val="single" w:color="8C9BAB" w:sz="4"/>
+              <w:left w:val="single" w:color="8C9BAB" w:sz="4"/>
+              <w:bottom w:val="single" w:color="8C9BAB" w:sz="4"/>
+              <w:right w:val="single" w:color="8C9BAB" w:sz="4"/>
+            </w:tcBorders>
+            <w:tcMar>
+              <w:top w:type="dxa" w:w="60"/>
+              <w:left w:type="dxa" w:w="90"/>
+              <w:bottom w:type="dxa" w:w="60"/>
+              <w:right w:type="dxa" w:w="90"/>
+            </w:tcMar>
+            <w:vAlign w:val="top"/>
+          </w:tcPr>
+          <w:p>
+            <w:pPr>
+              <w:spacing w:after="40"/>
+              <w:jc w:val="left"/>
+            </w:pPr>
+            <w:r>
+              <w:rPr>
+                <w:b w:val="false"/>
+                <w:bCs w:val="false"/>
+                <w:sz w:val="18"/>
+                <w:szCs w:val="18"/>
+              </w:rPr>
+              <w:t xml:space="preserve">UAT-14</w:t>
+            </w:r>
+          </w:p>
+        </w:tc>
+        <w:tc>
+          <w:tcPr>
+            <w:tcW w:type="dxa" w:w="3971"/>
+            <w:tcBorders>
+              <w:top w:val="single" w:color="8C9BAB" w:sz="4"/>
+              <w:left w:val="single" w:color="8C9BAB" w:sz="4"/>
+              <w:bottom w:val="single" w:color="8C9BAB" w:sz="4"/>
+              <w:right w:val="single" w:color="8C9BAB" w:sz="4"/>
+            </w:tcBorders>
+            <w:tcMar>
+              <w:top w:type="dxa" w:w="60"/>
+              <w:left w:type="dxa" w:w="90"/>
+              <w:bottom w:type="dxa" w:w="60"/>
+              <w:right w:type="dxa" w:w="90"/>
+            </w:tcMar>
+            <w:vAlign w:val="top"/>
+          </w:tcPr>
+          <w:p>
+            <w:pPr>
+              <w:spacing w:after="40"/>
+              <w:jc w:val="left"/>
+            </w:pPr>
+            <w:r>
+              <w:rPr>
+                <w:b w:val="false"/>
+                <w:bCs w:val="false"/>
+                <w:sz w:val="18"/>
+                <w:szCs w:val="18"/>
+              </w:rPr>
+              <w:t xml:space="preserve">With 50 students registering for 10 seats at once, 16, 12 and 11 were enrolled in three runs. The seat check and the save were separate steps, so simultaneous requests saw the same free seat (AC-02).</w:t>
+            </w:r>
+          </w:p>
+        </w:tc>
+        <w:tc>
+          <w:tcPr>
+            <w:tcW w:type="dxa" w:w="903"/>
+            <w:tcBorders>
+              <w:top w:val="single" w:color="8C9BAB" w:sz="4"/>
+              <w:left w:val="single" w:color="8C9BAB" w:sz="4"/>
+              <w:bottom w:val="single" w:color="8C9BAB" w:sz="4"/>
+              <w:right w:val="single" w:color="8C9BAB" w:sz="4"/>
+            </w:tcBorders>
+            <w:tcMar>
+              <w:top w:type="dxa" w:w="60"/>
+              <w:left w:type="dxa" w:w="90"/>
+              <w:bottom w:type="dxa" w:w="60"/>
+              <w:right w:type="dxa" w:w="90"/>
+            </w:tcMar>
+            <w:vAlign w:val="top"/>
+          </w:tcPr>
+          <w:p>
+            <w:pPr>
+              <w:spacing w:after="40"/>
+              <w:jc w:val="left"/>
+            </w:pPr>
+            <w:r>
+              <w:rPr>
+                <w:b w:val="false"/>
+                <w:bCs w:val="false"/>
+                <w:sz w:val="18"/>
+                <w:szCs w:val="18"/>
+              </w:rPr>
+              <w:t xml:space="preserve">Critical</w:t>
+            </w:r>
+          </w:p>
+        </w:tc>
+        <w:tc>
+          <w:tcPr>
+            <w:tcW w:type="dxa" w:w="2347"/>
+            <w:tcBorders>
+              <w:top w:val="single" w:color="8C9BAB" w:sz="4"/>
+              <w:left w:val="single" w:color="8C9BAB" w:sz="4"/>
+              <w:bottom w:val="single" w:color="8C9BAB" w:sz="4"/>
+              <w:right w:val="single" w:color="8C9BAB" w:sz="4"/>
+            </w:tcBorders>
+            <w:tcMar>
+              <w:top w:type="dxa" w:w="60"/>
+              <w:left w:type="dxa" w:w="90"/>
+              <w:bottom w:type="dxa" w:w="60"/>
+              <w:right w:type="dxa" w:w="90"/>
+            </w:tcMar>
+            <w:vAlign w:val="top"/>
+          </w:tcPr>
+          <w:p>
+            <w:pPr>
+              <w:spacing w:after="40"/>
+              <w:jc w:val="left"/>
+            </w:pPr>
+            <w:r>
+              <w:rPr>
+                <w:b w:val="false"/>
+                <w:bCs w:val="false"/>
+                <w:sz w:val="18"/>
+                <w:szCs w:val="18"/>
+              </w:rPr>
+              <w:t xml:space="preserve">v1.1 locks the course while checking and saving. Exactly 10 enrolled in 3 of 3 runs. Closed.</w:t>
             </w:r>
           </w:p>
         </w:tc>
@@ -6737,7 +6944,7 @@
         </w:trPr>
         <w:tc>
           <w:tcPr>
-            <w:tcW w:type="dxa" w:w="1805"/>
+            <w:tcW w:type="dxa" w:w="812"/>
             <w:tcBorders>
               <w:top w:val="single" w:color="8C9BAB" w:sz="4"/>
               <w:left w:val="single" w:color="8C9BAB" w:sz="4"/>
@@ -6764,40 +6971,139 @@
                 <w:sz w:val="18"/>
                 <w:szCs w:val="18"/>
               </w:rPr>
-              <w:t xml:space="preserve">Severity</w:t>
-            </w:r>
-          </w:p>
-        </w:tc>
-        <w:tc>
-          <w:tcPr>
-            <w:tcW w:type="dxa" w:w="7221"/>
-            <w:tcBorders>
-              <w:top w:val="single" w:color="8C9BAB" w:sz="4"/>
-              <w:left w:val="single" w:color="8C9BAB" w:sz="4"/>
-              <w:bottom w:val="single" w:color="8C9BAB" w:sz="4"/>
-              <w:right w:val="single" w:color="8C9BAB" w:sz="4"/>
-            </w:tcBorders>
-            <w:tcMar>
-              <w:top w:type="dxa" w:w="60"/>
-              <w:left w:type="dxa" w:w="90"/>
-              <w:bottom w:type="dxa" w:w="60"/>
-              <w:right w:type="dxa" w:w="90"/>
-            </w:tcMar>
-            <w:vAlign w:val="top"/>
-          </w:tcPr>
-          <w:p>
-            <w:pPr>
-              <w:spacing w:after="40"/>
-              <w:jc w:val="left"/>
-            </w:pPr>
-            <w:r>
-              <w:rPr>
-                <w:b w:val="false"/>
-                <w:bCs w:val="false"/>
-                <w:sz w:val="18"/>
-                <w:szCs w:val="18"/>
-              </w:rPr>
-              <w:t xml:space="preserve">Critical: breaks AC-02, a criterion set by the brief</w:t>
+              <w:t xml:space="preserve">DEF-02</w:t>
+            </w:r>
+          </w:p>
+        </w:tc>
+        <w:tc>
+          <w:tcPr>
+            <w:tcW w:type="dxa" w:w="993"/>
+            <w:tcBorders>
+              <w:top w:val="single" w:color="8C9BAB" w:sz="4"/>
+              <w:left w:val="single" w:color="8C9BAB" w:sz="4"/>
+              <w:bottom w:val="single" w:color="8C9BAB" w:sz="4"/>
+              <w:right w:val="single" w:color="8C9BAB" w:sz="4"/>
+            </w:tcBorders>
+            <w:tcMar>
+              <w:top w:type="dxa" w:w="60"/>
+              <w:left w:type="dxa" w:w="90"/>
+              <w:bottom w:type="dxa" w:w="60"/>
+              <w:right w:type="dxa" w:w="90"/>
+            </w:tcMar>
+            <w:vAlign w:val="top"/>
+          </w:tcPr>
+          <w:p>
+            <w:pPr>
+              <w:spacing w:after="40"/>
+              <w:jc w:val="left"/>
+            </w:pPr>
+            <w:r>
+              <w:rPr>
+                <w:b w:val="false"/>
+                <w:bCs w:val="false"/>
+                <w:sz w:val="18"/>
+                <w:szCs w:val="18"/>
+              </w:rPr>
+              <w:t xml:space="preserve">FT-31</w:t>
+            </w:r>
+          </w:p>
+        </w:tc>
+        <w:tc>
+          <w:tcPr>
+            <w:tcW w:type="dxa" w:w="3971"/>
+            <w:tcBorders>
+              <w:top w:val="single" w:color="8C9BAB" w:sz="4"/>
+              <w:left w:val="single" w:color="8C9BAB" w:sz="4"/>
+              <w:bottom w:val="single" w:color="8C9BAB" w:sz="4"/>
+              <w:right w:val="single" w:color="8C9BAB" w:sz="4"/>
+            </w:tcBorders>
+            <w:tcMar>
+              <w:top w:type="dxa" w:w="60"/>
+              <w:left w:type="dxa" w:w="90"/>
+              <w:bottom w:type="dxa" w:w="60"/>
+              <w:right w:type="dxa" w:w="90"/>
+            </w:tcMar>
+            <w:vAlign w:val="top"/>
+          </w:tcPr>
+          <w:p>
+            <w:pPr>
+              <w:spacing w:after="40"/>
+              <w:jc w:val="left"/>
+            </w:pPr>
+            <w:r>
+              <w:rPr>
+                <w:b w:val="false"/>
+                <w:bCs w:val="false"/>
+                <w:sz w:val="18"/>
+                <w:szCs w:val="18"/>
+              </w:rPr>
+              <w:t xml:space="preserve">Logout did not end the session on the server, so a copied cookie still worked (AC-03).</w:t>
+            </w:r>
+          </w:p>
+        </w:tc>
+        <w:tc>
+          <w:tcPr>
+            <w:tcW w:type="dxa" w:w="903"/>
+            <w:tcBorders>
+              <w:top w:val="single" w:color="8C9BAB" w:sz="4"/>
+              <w:left w:val="single" w:color="8C9BAB" w:sz="4"/>
+              <w:bottom w:val="single" w:color="8C9BAB" w:sz="4"/>
+              <w:right w:val="single" w:color="8C9BAB" w:sz="4"/>
+            </w:tcBorders>
+            <w:tcMar>
+              <w:top w:type="dxa" w:w="60"/>
+              <w:left w:type="dxa" w:w="90"/>
+              <w:bottom w:type="dxa" w:w="60"/>
+              <w:right w:type="dxa" w:w="90"/>
+            </w:tcMar>
+            <w:vAlign w:val="top"/>
+          </w:tcPr>
+          <w:p>
+            <w:pPr>
+              <w:spacing w:after="40"/>
+              <w:jc w:val="left"/>
+            </w:pPr>
+            <w:r>
+              <w:rPr>
+                <w:b w:val="false"/>
+                <w:bCs w:val="false"/>
+                <w:sz w:val="18"/>
+                <w:szCs w:val="18"/>
+              </w:rPr>
+              <w:t xml:space="preserve">Medium</w:t>
+            </w:r>
+          </w:p>
+        </w:tc>
+        <w:tc>
+          <w:tcPr>
+            <w:tcW w:type="dxa" w:w="2347"/>
+            <w:tcBorders>
+              <w:top w:val="single" w:color="8C9BAB" w:sz="4"/>
+              <w:left w:val="single" w:color="8C9BAB" w:sz="4"/>
+              <w:bottom w:val="single" w:color="8C9BAB" w:sz="4"/>
+              <w:right w:val="single" w:color="8C9BAB" w:sz="4"/>
+            </w:tcBorders>
+            <w:tcMar>
+              <w:top w:type="dxa" w:w="60"/>
+              <w:left w:type="dxa" w:w="90"/>
+              <w:bottom w:type="dxa" w:w="60"/>
+              <w:right w:type="dxa" w:w="90"/>
+            </w:tcMar>
+            <w:vAlign w:val="top"/>
+          </w:tcPr>
+          <w:p>
+            <w:pPr>
+              <w:spacing w:after="40"/>
+              <w:jc w:val="left"/>
+            </w:pPr>
+            <w:r>
+              <w:rPr>
+                <w:b w:val="false"/>
+                <w:bCs w:val="false"/>
+                <w:sz w:val="18"/>
+                <w:szCs w:val="18"/>
+              </w:rPr>
+              <w:t xml:space="preserve">v1.2 ends the session on logout. Cycle 3 passed. Closed.</w:t>
             </w:r>
           </w:p>
         </w:tc>
@@ -6808,7 +7114,7 @@
         </w:trPr>
         <w:tc>
           <w:tcPr>
-            <w:tcW w:type="dxa" w:w="1805"/>
+            <w:tcW w:type="dxa" w:w="812"/>
             <w:tcBorders>
               <w:top w:val="single" w:color="8C9BAB" w:sz="4"/>
               <w:left w:val="single" w:color="8C9BAB" w:sz="4"/>
@@ -6835,182 +7141,139 @@
                 <w:sz w:val="18"/>
                 <w:szCs w:val="18"/>
               </w:rPr>
-              <w:t xml:space="preserve">Actual result</w:t>
-            </w:r>
-          </w:p>
-        </w:tc>
-        <w:tc>
-          <w:tcPr>
-            <w:tcW w:type="dxa" w:w="7221"/>
-            <w:tcBorders>
-              <w:top w:val="single" w:color="8C9BAB" w:sz="4"/>
-              <w:left w:val="single" w:color="8C9BAB" w:sz="4"/>
-              <w:bottom w:val="single" w:color="8C9BAB" w:sz="4"/>
-              <w:right w:val="single" w:color="8C9BAB" w:sz="4"/>
-            </w:tcBorders>
-            <w:tcMar>
-              <w:top w:type="dxa" w:w="60"/>
-              <w:left w:type="dxa" w:w="90"/>
-              <w:bottom w:type="dxa" w:w="60"/>
-              <w:right w:type="dxa" w:w="90"/>
-            </w:tcMar>
-            <w:vAlign w:val="top"/>
-          </w:tcPr>
-          <w:p>
-            <w:pPr>
-              <w:spacing w:after="40"/>
-              <w:jc w:val="left"/>
-            </w:pPr>
-            <w:r>
-              <w:rPr>
-                <w:b w:val="false"/>
-                <w:bCs w:val="false"/>
-                <w:sz w:val="18"/>
-                <w:szCs w:val="18"/>
-              </w:rPr>
-              <w:t xml:space="preserve">When 50 students registered for 10 seats at once, 16, 12 and 11 were enrolled in three runs.</w:t>
-            </w:r>
-          </w:p>
-        </w:tc>
-      </w:tr>
-      <w:tr>
-        <w:trPr>
-          <w:cantSplit/>
-        </w:trPr>
-        <w:tc>
-          <w:tcPr>
-            <w:tcW w:type="dxa" w:w="1805"/>
-            <w:tcBorders>
-              <w:top w:val="single" w:color="8C9BAB" w:sz="4"/>
-              <w:left w:val="single" w:color="8C9BAB" w:sz="4"/>
-              <w:bottom w:val="single" w:color="8C9BAB" w:sz="4"/>
-              <w:right w:val="single" w:color="8C9BAB" w:sz="4"/>
-            </w:tcBorders>
-            <w:tcMar>
-              <w:top w:type="dxa" w:w="60"/>
-              <w:left w:type="dxa" w:w="90"/>
-              <w:bottom w:type="dxa" w:w="60"/>
-              <w:right w:type="dxa" w:w="90"/>
-            </w:tcMar>
-            <w:vAlign w:val="top"/>
-          </w:tcPr>
-          <w:p>
-            <w:pPr>
-              <w:spacing w:after="40"/>
-              <w:jc w:val="left"/>
-            </w:pPr>
-            <w:r>
-              <w:rPr>
-                <w:b/>
-                <w:bCs/>
-                <w:sz w:val="18"/>
-                <w:szCs w:val="18"/>
-              </w:rPr>
-              <w:t xml:space="preserve">Cause and fix</w:t>
-            </w:r>
-          </w:p>
-        </w:tc>
-        <w:tc>
-          <w:tcPr>
-            <w:tcW w:type="dxa" w:w="7221"/>
-            <w:tcBorders>
-              <w:top w:val="single" w:color="8C9BAB" w:sz="4"/>
-              <w:left w:val="single" w:color="8C9BAB" w:sz="4"/>
-              <w:bottom w:val="single" w:color="8C9BAB" w:sz="4"/>
-              <w:right w:val="single" w:color="8C9BAB" w:sz="4"/>
-            </w:tcBorders>
-            <w:tcMar>
-              <w:top w:type="dxa" w:w="60"/>
-              <w:left w:type="dxa" w:w="90"/>
-              <w:bottom w:type="dxa" w:w="60"/>
-              <w:right w:type="dxa" w:w="90"/>
-            </w:tcMar>
-            <w:vAlign w:val="top"/>
-          </w:tcPr>
-          <w:p>
-            <w:pPr>
-              <w:spacing w:after="40"/>
-              <w:jc w:val="left"/>
-            </w:pPr>
-            <w:r>
-              <w:rPr>
-                <w:b w:val="false"/>
-                <w:bCs w:val="false"/>
-                <w:sz w:val="18"/>
-                <w:szCs w:val="18"/>
-              </w:rPr>
-              <w:t xml:space="preserve">The seat count was checked and the enrolment saved as two separate steps, so simultaneous requests all saw the same free seat. Build v1.1 locks the course while checking and saving.</w:t>
-            </w:r>
-          </w:p>
-        </w:tc>
-      </w:tr>
-      <w:tr>
-        <w:trPr>
-          <w:cantSplit/>
-        </w:trPr>
-        <w:tc>
-          <w:tcPr>
-            <w:tcW w:type="dxa" w:w="1805"/>
-            <w:tcBorders>
-              <w:top w:val="single" w:color="8C9BAB" w:sz="4"/>
-              <w:left w:val="single" w:color="8C9BAB" w:sz="4"/>
-              <w:bottom w:val="single" w:color="8C9BAB" w:sz="4"/>
-              <w:right w:val="single" w:color="8C9BAB" w:sz="4"/>
-            </w:tcBorders>
-            <w:tcMar>
-              <w:top w:type="dxa" w:w="60"/>
-              <w:left w:type="dxa" w:w="90"/>
-              <w:bottom w:type="dxa" w:w="60"/>
-              <w:right w:type="dxa" w:w="90"/>
-            </w:tcMar>
-            <w:vAlign w:val="top"/>
-          </w:tcPr>
-          <w:p>
-            <w:pPr>
-              <w:spacing w:after="40"/>
-              <w:jc w:val="left"/>
-            </w:pPr>
-            <w:r>
-              <w:rPr>
-                <w:b/>
-                <w:bCs/>
-                <w:sz w:val="18"/>
-                <w:szCs w:val="18"/>
-              </w:rPr>
-              <w:t xml:space="preserve">Retest</w:t>
-            </w:r>
-          </w:p>
-        </w:tc>
-        <w:tc>
-          <w:tcPr>
-            <w:tcW w:type="dxa" w:w="7221"/>
-            <w:tcBorders>
-              <w:top w:val="single" w:color="8C9BAB" w:sz="4"/>
-              <w:left w:val="single" w:color="8C9BAB" w:sz="4"/>
-              <w:bottom w:val="single" w:color="8C9BAB" w:sz="4"/>
-              <w:right w:val="single" w:color="8C9BAB" w:sz="4"/>
-            </w:tcBorders>
-            <w:tcMar>
-              <w:top w:type="dxa" w:w="60"/>
-              <w:left w:type="dxa" w:w="90"/>
-              <w:bottom w:type="dxa" w:w="60"/>
-              <w:right w:type="dxa" w:w="90"/>
-            </w:tcMar>
-            <w:vAlign w:val="top"/>
-          </w:tcPr>
-          <w:p>
-            <w:pPr>
-              <w:spacing w:after="40"/>
-              <w:jc w:val="left"/>
-            </w:pPr>
-            <w:r>
-              <w:rPr>
-                <w:b w:val="false"/>
-                <w:bCs w:val="false"/>
-                <w:sz w:val="18"/>
-                <w:szCs w:val="18"/>
-              </w:rPr>
-              <w:t xml:space="preserve">Exactly 10 enrolled in 3 out of 3 runs. Status: Closed.</w:t>
+              <w:t xml:space="preserve">DEF-03</w:t>
+            </w:r>
+          </w:p>
+        </w:tc>
+        <w:tc>
+          <w:tcPr>
+            <w:tcW w:type="dxa" w:w="993"/>
+            <w:tcBorders>
+              <w:top w:val="single" w:color="8C9BAB" w:sz="4"/>
+              <w:left w:val="single" w:color="8C9BAB" w:sz="4"/>
+              <w:bottom w:val="single" w:color="8C9BAB" w:sz="4"/>
+              <w:right w:val="single" w:color="8C9BAB" w:sz="4"/>
+            </w:tcBorders>
+            <w:tcMar>
+              <w:top w:type="dxa" w:w="60"/>
+              <w:left w:type="dxa" w:w="90"/>
+              <w:bottom w:type="dxa" w:w="60"/>
+              <w:right w:type="dxa" w:w="90"/>
+            </w:tcMar>
+            <w:vAlign w:val="top"/>
+          </w:tcPr>
+          <w:p>
+            <w:pPr>
+              <w:spacing w:after="40"/>
+              <w:jc w:val="left"/>
+            </w:pPr>
+            <w:r>
+              <w:rPr>
+                <w:b w:val="false"/>
+                <w:bCs w:val="false"/>
+                <w:sz w:val="18"/>
+                <w:szCs w:val="18"/>
+              </w:rPr>
+              <w:t xml:space="preserve">ST-06, ST-07</w:t>
+            </w:r>
+          </w:p>
+        </w:tc>
+        <w:tc>
+          <w:tcPr>
+            <w:tcW w:type="dxa" w:w="3971"/>
+            <w:tcBorders>
+              <w:top w:val="single" w:color="8C9BAB" w:sz="4"/>
+              <w:left w:val="single" w:color="8C9BAB" w:sz="4"/>
+              <w:bottom w:val="single" w:color="8C9BAB" w:sz="4"/>
+              <w:right w:val="single" w:color="8C9BAB" w:sz="4"/>
+            </w:tcBorders>
+            <w:tcMar>
+              <w:top w:type="dxa" w:w="60"/>
+              <w:left w:type="dxa" w:w="90"/>
+              <w:bottom w:type="dxa" w:w="60"/>
+              <w:right w:type="dxa" w:w="90"/>
+            </w:tcMar>
+            <w:vAlign w:val="top"/>
+          </w:tcPr>
+          <w:p>
+            <w:pPr>
+              <w:spacing w:after="40"/>
+              <w:jc w:val="left"/>
+            </w:pPr>
+            <w:r>
+              <w:rPr>
+                <w:b w:val="false"/>
+                <w:bCs w:val="false"/>
+                <w:sz w:val="18"/>
+                <w:szCs w:val="18"/>
+              </w:rPr>
+              <w:t xml:space="preserve">With 40+ requests at the same instant, a few connections were refused (AC-09).</w:t>
+            </w:r>
+          </w:p>
+        </w:tc>
+        <w:tc>
+          <w:tcPr>
+            <w:tcW w:type="dxa" w:w="903"/>
+            <w:tcBorders>
+              <w:top w:val="single" w:color="8C9BAB" w:sz="4"/>
+              <w:left w:val="single" w:color="8C9BAB" w:sz="4"/>
+              <w:bottom w:val="single" w:color="8C9BAB" w:sz="4"/>
+              <w:right w:val="single" w:color="8C9BAB" w:sz="4"/>
+            </w:tcBorders>
+            <w:tcMar>
+              <w:top w:type="dxa" w:w="60"/>
+              <w:left w:type="dxa" w:w="90"/>
+              <w:bottom w:type="dxa" w:w="60"/>
+              <w:right w:type="dxa" w:w="90"/>
+            </w:tcMar>
+            <w:vAlign w:val="top"/>
+          </w:tcPr>
+          <w:p>
+            <w:pPr>
+              <w:spacing w:after="40"/>
+              <w:jc w:val="left"/>
+            </w:pPr>
+            <w:r>
+              <w:rPr>
+                <w:b w:val="false"/>
+                <w:bCs w:val="false"/>
+                <w:sz w:val="18"/>
+                <w:szCs w:val="18"/>
+              </w:rPr>
+              <w:t xml:space="preserve">High</w:t>
+            </w:r>
+          </w:p>
+        </w:tc>
+        <w:tc>
+          <w:tcPr>
+            <w:tcW w:type="dxa" w:w="2347"/>
+            <w:tcBorders>
+              <w:top w:val="single" w:color="8C9BAB" w:sz="4"/>
+              <w:left w:val="single" w:color="8C9BAB" w:sz="4"/>
+              <w:bottom w:val="single" w:color="8C9BAB" w:sz="4"/>
+              <w:right w:val="single" w:color="8C9BAB" w:sz="4"/>
+            </w:tcBorders>
+            <w:tcMar>
+              <w:top w:type="dxa" w:w="60"/>
+              <w:left w:type="dxa" w:w="90"/>
+              <w:bottom w:type="dxa" w:w="60"/>
+              <w:right w:type="dxa" w:w="90"/>
+            </w:tcMar>
+            <w:vAlign w:val="top"/>
+          </w:tcPr>
+          <w:p>
+            <w:pPr>
+              <w:spacing w:after="40"/>
+              <w:jc w:val="left"/>
+            </w:pPr>
+            <w:r>
+              <w:rPr>
+                <w:b w:val="false"/>
+                <w:bCs w:val="false"/>
+                <w:sz w:val="18"/>
+                <w:szCs w:val="18"/>
+              </w:rPr>
+              <w:t xml:space="preserve">v1.2 queues up to 128 connections. Cycle 3 passed. Closed.</w:t>
             </w:r>
           </w:p>
         </w:tc>
@@ -7028,7 +7291,7 @@
           <w:sz w:val="20"/>
           <w:szCs w:val="20"/>
         </w:rPr>
-        <w:t xml:space="preserve">Table 4.4: Defect report</w:t>
+        <w:t xml:space="preserve">Table 4.4: Defects (DEF-02 and DEF-03 were found by functional and system testing)</w:t>
       </w:r>
     </w:p>
     <w:p>
@@ -7045,7 +7308,7 @@
         <w:jc w:val="both"/>
       </w:pPr>
       <w:r>
-        <w:t xml:space="preserve">All business rules worked for individual students, and confirmations took at most 0.14 s, well under the 5-second target. Under 50 simultaneous registrations the slowest response was 1.53 s, so performance still meets AC-09. The only defect appeared when students competed for the same seats at the same moment. That situation happens on registration day but cannot be found by testing one student at a time, which is why the simultaneous test was included.</w:t>
+        <w:t xml:space="preserve">All business rules worked for individual students, and confirmations took at most 0.14 s, well under the 5-second target. Under 50 simultaneous registrations the slowest response was 1.53 s, so performance still meets AC-09. The acceptance defect appeared only when students competed for the same seats at the same moment. It cannot be found by testing one student at a time, which is why the simultaneous test was included.</w:t>
       </w:r>
     </w:p>
     <w:p>
@@ -7082,10 +7345,10 @@
           <w:b/>
           <w:bCs/>
         </w:rPr>
-        <w:t xml:space="preserve">Build v1.1: ACCEPTED. </w:t>
+        <w:t xml:space="preserve">Build v1.2: ACCEPTED. </w:t>
       </w:r>
       <w:r>
-        <w:t xml:space="preserve">All 9 criteria are met, all 15 tests pass and there are no open defects. Before release, we recommend re-running the load tests with more than 50 students and keeping UAT-14 in the regression suite.</w:t>
+        <w:t xml:space="preserve">All 9 criteria are met, all 15 tests pass in Cycle 3, and all three defects found across the project are closed. Before release, we recommend re-running the load tests on the real server with more students and keeping UAT-14 in the regression suite.</w:t>
       </w:r>
     </w:p>
     <w:sectPr>

</xml_diff>